<commit_message>
feat: updated project report
</commit_message>
<xml_diff>
--- a/Rapport Projet RL - Groupe 12.docx
+++ b/Rapport Projet RL - Groupe 12.docx
@@ -380,167 +380,14 @@
               </w:rPr>
               <w:t>K</w:t>
             </w:r>
-            <w:proofErr w:type="spellStart"/>
             <w:r>
               <w:rPr>
                 <w:rFonts w:ascii="Garamond" w:hAnsi="Garamond"/>
                 <w:b/>
                 <w:color w:val="595959"/>
                 <w:sz w:val="26"/>
-                <w:lang w:val="fr-FR"/>
-              </w:rPr>
-              <w:t>ossi</w:t>
-            </w:r>
-            <w:proofErr w:type="spellEnd"/>
-          </w:p>
-        </w:tc>
-      </w:tr>
-      <w:tr>
-        <w:trPr>
-          <w:trHeight w:val="695"/>
-        </w:trPr>
-        <w:tc>
-          <w:tcPr>
-            <w:tcW w:w="1410" w:type="dxa"/>
-            <w:vAlign w:val="center"/>
-          </w:tcPr>
-          <w:p>
-            <w:pPr>
-              <w:pStyle w:val="Normal1"/>
-              <w:jc w:val="both"/>
-              <w:rPr>
-                <w:rFonts w:ascii="Garamond" w:hAnsi="Garamond"/>
-                <w:b/>
-                <w:color w:val="595959"/>
-                <w:sz w:val="26"/>
-              </w:rPr>
-            </w:pPr>
-            <w:r>
-              <w:rPr>
-                <w:rFonts w:ascii="Garamond" w:hAnsi="Garamond"/>
-                <w:b/>
-                <w:color w:val="595959"/>
-                <w:sz w:val="26"/>
-              </w:rPr>
-              <w:t>2</w:t>
-            </w:r>
-          </w:p>
-        </w:tc>
-        <w:tc>
-          <w:tcPr>
-            <w:tcW w:w="7664" w:type="dxa"/>
-            <w:vAlign w:val="center"/>
-          </w:tcPr>
-          <w:p>
-            <w:pPr>
-              <w:pStyle w:val="Normal1"/>
-              <w:jc w:val="both"/>
-              <w:rPr>
-                <w:rFonts w:ascii="Garamond" w:hAnsi="Garamond"/>
-                <w:b/>
-                <w:color w:val="595959"/>
-                <w:sz w:val="26"/>
-                <w:lang w:val="fr-FR"/>
-              </w:rPr>
-            </w:pPr>
-            <w:r>
-              <w:rPr>
-                <w:rFonts w:ascii="Garamond" w:hAnsi="Garamond"/>
-                <w:b/>
-                <w:color w:val="595959"/>
-                <w:sz w:val="26"/>
-                <w:lang w:val="fr-FR"/>
-              </w:rPr>
-              <w:t>SERGEO S</w:t>
-            </w:r>
-            <w:r>
-              <w:rPr>
-                <w:rFonts w:ascii="Garamond" w:hAnsi="Garamond"/>
-                <w:b/>
-                <w:color w:val="595959"/>
-                <w:sz w:val="26"/>
-              </w:rPr>
-              <w:t>ELAGSA M</w:t>
-            </w:r>
-            <w:proofErr w:type="spellStart"/>
-            <w:r>
-              <w:rPr>
-                <w:rFonts w:ascii="Garamond" w:hAnsi="Garamond"/>
-                <w:b/>
-                <w:color w:val="595959"/>
-                <w:sz w:val="26"/>
-                <w:lang w:val="fr-FR"/>
-              </w:rPr>
-              <w:t>offo</w:t>
-            </w:r>
-            <w:proofErr w:type="spellEnd"/>
-          </w:p>
-        </w:tc>
-      </w:tr>
-      <w:tr>
-        <w:trPr>
-          <w:trHeight w:val="695"/>
-        </w:trPr>
-        <w:tc>
-          <w:tcPr>
-            <w:tcW w:w="1410" w:type="dxa"/>
-            <w:vAlign w:val="center"/>
-          </w:tcPr>
-          <w:p>
-            <w:pPr>
-              <w:pStyle w:val="Normal1"/>
-              <w:jc w:val="both"/>
-              <w:rPr>
-                <w:rFonts w:ascii="Garamond" w:hAnsi="Garamond"/>
-                <w:b/>
-                <w:color w:val="595959"/>
-                <w:sz w:val="26"/>
-              </w:rPr>
-            </w:pPr>
-            <w:r>
-              <w:rPr>
-                <w:rFonts w:ascii="Garamond" w:hAnsi="Garamond"/>
-                <w:b/>
-                <w:color w:val="595959"/>
-                <w:sz w:val="26"/>
-              </w:rPr>
-              <w:t>3</w:t>
-            </w:r>
-          </w:p>
-        </w:tc>
-        <w:tc>
-          <w:tcPr>
-            <w:tcW w:w="7664" w:type="dxa"/>
-            <w:vAlign w:val="center"/>
-          </w:tcPr>
-          <w:p>
-            <w:pPr>
-              <w:pStyle w:val="Normal1"/>
-              <w:jc w:val="both"/>
-              <w:rPr>
-                <w:rFonts w:ascii="Garamond" w:hAnsi="Garamond"/>
-                <w:b/>
-                <w:color w:val="595959"/>
-                <w:sz w:val="26"/>
-              </w:rPr>
-            </w:pPr>
-            <w:r>
-              <w:rPr>
-                <w:rFonts w:ascii="Garamond" w:hAnsi="Garamond"/>
-                <w:b/>
-                <w:color w:val="595959"/>
-                <w:sz w:val="26"/>
-              </w:rPr>
-              <w:t xml:space="preserve">IDRISSA SEYDOU </w:t>
-            </w:r>
-            <w:r>
-              <w:rPr>
-                <w:rFonts w:ascii="Garamond" w:hAnsi="Garamond"/>
-                <w:b/>
-                <w:color w:val="595959"/>
-                <w:sz w:val="26"/>
-              </w:rPr>
-              <w:t>Gueye</w:t>
+              </w:rPr>
+              <w:t>OSSI HOUNSOUNOU</w:t>
             </w:r>
           </w:p>
         </w:tc>
@@ -572,6 +419,145 @@
                 <w:color w:val="595959"/>
                 <w:sz w:val="26"/>
               </w:rPr>
+              <w:t>2</w:t>
+            </w:r>
+          </w:p>
+        </w:tc>
+        <w:tc>
+          <w:tcPr>
+            <w:tcW w:w="7664" w:type="dxa"/>
+            <w:vAlign w:val="center"/>
+          </w:tcPr>
+          <w:p>
+            <w:pPr>
+              <w:pStyle w:val="Normal1"/>
+              <w:jc w:val="both"/>
+              <w:rPr>
+                <w:rFonts w:ascii="Garamond" w:hAnsi="Garamond"/>
+                <w:b/>
+                <w:color w:val="595959"/>
+                <w:sz w:val="26"/>
+                <w:lang w:val="fr-FR"/>
+              </w:rPr>
+            </w:pPr>
+            <w:r>
+              <w:rPr>
+                <w:rFonts w:ascii="Garamond" w:hAnsi="Garamond"/>
+                <w:b/>
+                <w:color w:val="595959"/>
+                <w:sz w:val="26"/>
+                <w:lang w:val="fr-FR"/>
+              </w:rPr>
+              <w:t>SERGEO S</w:t>
+            </w:r>
+            <w:r>
+              <w:rPr>
+                <w:rFonts w:ascii="Garamond" w:hAnsi="Garamond"/>
+                <w:b/>
+                <w:color w:val="595959"/>
+                <w:sz w:val="26"/>
+              </w:rPr>
+              <w:t>ELAGSA M</w:t>
+            </w:r>
+            <w:r>
+              <w:rPr>
+                <w:rFonts w:ascii="Garamond" w:hAnsi="Garamond"/>
+                <w:b/>
+                <w:color w:val="595959"/>
+                <w:sz w:val="26"/>
+                <w:lang w:val="fr-FR"/>
+              </w:rPr>
+              <w:t>offo</w:t>
+            </w:r>
+          </w:p>
+        </w:tc>
+      </w:tr>
+      <w:tr>
+        <w:trPr>
+          <w:trHeight w:val="695"/>
+        </w:trPr>
+        <w:tc>
+          <w:tcPr>
+            <w:tcW w:w="1410" w:type="dxa"/>
+            <w:vAlign w:val="center"/>
+          </w:tcPr>
+          <w:p>
+            <w:pPr>
+              <w:pStyle w:val="Normal1"/>
+              <w:jc w:val="both"/>
+              <w:rPr>
+                <w:rFonts w:ascii="Garamond" w:hAnsi="Garamond"/>
+                <w:b/>
+                <w:color w:val="595959"/>
+                <w:sz w:val="26"/>
+              </w:rPr>
+            </w:pPr>
+            <w:r>
+              <w:rPr>
+                <w:rFonts w:ascii="Garamond" w:hAnsi="Garamond"/>
+                <w:b/>
+                <w:color w:val="595959"/>
+                <w:sz w:val="26"/>
+              </w:rPr>
+              <w:t>3</w:t>
+            </w:r>
+          </w:p>
+        </w:tc>
+        <w:tc>
+          <w:tcPr>
+            <w:tcW w:w="7664" w:type="dxa"/>
+            <w:vAlign w:val="center"/>
+          </w:tcPr>
+          <w:p>
+            <w:pPr>
+              <w:pStyle w:val="Normal1"/>
+              <w:jc w:val="both"/>
+              <w:rPr>
+                <w:rFonts w:ascii="Garamond" w:hAnsi="Garamond"/>
+                <w:b/>
+                <w:color w:val="595959"/>
+                <w:sz w:val="26"/>
+              </w:rPr>
+            </w:pPr>
+            <w:r>
+              <w:rPr>
+                <w:rFonts w:ascii="Garamond" w:hAnsi="Garamond"/>
+                <w:b/>
+                <w:color w:val="595959"/>
+                <w:sz w:val="26"/>
+              </w:rPr>
+              <w:t>IDRISSA SEYDOU Gueye</w:t>
+            </w:r>
+          </w:p>
+        </w:tc>
+      </w:tr>
+      <w:tr>
+        <w:trPr>
+          <w:trHeight w:val="695"/>
+        </w:trPr>
+        <w:tc>
+          <w:tcPr>
+            <w:tcW w:w="1410" w:type="dxa"/>
+            <w:vAlign w:val="center"/>
+          </w:tcPr>
+          <w:p>
+            <w:pPr>
+              <w:pStyle w:val="Normal1"/>
+              <w:jc w:val="both"/>
+              <w:rPr>
+                <w:rFonts w:ascii="Garamond" w:hAnsi="Garamond"/>
+                <w:b/>
+                <w:color w:val="595959"/>
+                <w:sz w:val="26"/>
+              </w:rPr>
+            </w:pPr>
+            <w:r>
+              <w:rPr>
+                <w:rFonts w:ascii="Garamond" w:hAnsi="Garamond"/>
+                <w:b/>
+                <w:color w:val="595959"/>
+                <w:sz w:val="26"/>
+              </w:rPr>
               <w:t>4</w:t>
             </w:r>
           </w:p>
@@ -599,25 +585,7 @@
                 <w:color w:val="595959"/>
                 <w:sz w:val="26"/>
               </w:rPr>
-              <w:t xml:space="preserve">ZANA BABA STÉPHANE </w:t>
-            </w:r>
-            <w:r>
-              <w:rPr>
-                <w:rFonts w:ascii="Garamond" w:hAnsi="Garamond"/>
-                <w:b/>
-                <w:color w:val="595959"/>
-                <w:sz w:val="26"/>
-              </w:rPr>
-              <w:t>C</w:t>
-            </w:r>
-            <w:r>
-              <w:rPr>
-                <w:rFonts w:ascii="Garamond" w:hAnsi="Garamond"/>
-                <w:b/>
-                <w:color w:val="595959"/>
-                <w:sz w:val="26"/>
-              </w:rPr>
-              <w:t>oulibaly</w:t>
+              <w:t>ZANA BABA STÉPHANE Coulibaly</w:t>
             </w:r>
           </w:p>
         </w:tc>
@@ -744,12 +712,6 @@
           <w:rFonts w:ascii="Garamond" w:hAnsi="Garamond"/>
         </w:rPr>
       </w:pPr>
-      <w:r>
-        <w:rPr>
-          <w:rFonts w:ascii="Garamond" w:hAnsi="Garamond"/>
-        </w:rPr>
-        <w:br w:type="page"/>
-      </w:r>
     </w:p>
     <w:p>
       <w:pPr>
@@ -764,7 +726,6 @@
         <w:rPr>
           <w:rFonts w:ascii="Garamond" w:hAnsi="Garamond"/>
         </w:rPr>
-        <w:lastRenderedPageBreak/>
         <w:t>1. Introduction</w:t>
       </w:r>
     </w:p>
@@ -1034,14 +995,9 @@
         <w:jc w:val="both"/>
         <w:rPr>
           <w:rFonts w:ascii="Garamond" w:hAnsi="Garamond"/>
-        </w:rPr>
-      </w:pPr>
-      <w:r>
-        <w:rPr>
-          <w:rFonts w:ascii="Garamond" w:hAnsi="Garamond"/>
-        </w:rPr>
-        <w:br w:type="page"/>
-      </w:r>
+          <w:lang w:val="fr-FR"/>
+        </w:rPr>
+      </w:pPr>
     </w:p>
     <w:p>
       <w:pPr>
@@ -1056,7 +1012,6 @@
         <w:rPr>
           <w:rFonts w:ascii="Garamond" w:hAnsi="Garamond"/>
         </w:rPr>
-        <w:lastRenderedPageBreak/>
         <w:t>3. État de l'art</w:t>
       </w:r>
     </w:p>
@@ -1132,12 +1087,6 @@
           <w:rFonts w:ascii="Garamond" w:hAnsi="Garamond"/>
         </w:rPr>
       </w:pPr>
-      <w:r>
-        <w:rPr>
-          <w:rFonts w:ascii="Garamond" w:hAnsi="Garamond"/>
-        </w:rPr>
-        <w:br w:type="page"/>
-      </w:r>
     </w:p>
     <w:p>
       <w:pPr>
@@ -1152,7 +1101,6 @@
         <w:rPr>
           <w:rFonts w:ascii="Garamond" w:hAnsi="Garamond"/>
         </w:rPr>
-        <w:lastRenderedPageBreak/>
         <w:t>4. Formulation MDP</w:t>
       </w:r>
     </w:p>
@@ -1377,6 +1325,7 @@
         <w:rPr>
           <w:rFonts w:ascii="Garamond" w:hAnsi="Garamond"/>
         </w:rPr>
+        <w:lastRenderedPageBreak/>
         <w:t>Discret : 25 actions (move to zone 0, 1, ..., 24) sur grille 5×5</w:t>
       </w:r>
     </w:p>
@@ -1420,12 +1369,6 @@
           <w:rFonts w:ascii="Garamond" w:hAnsi="Garamond"/>
         </w:rPr>
       </w:pPr>
-      <w:r>
-        <w:rPr>
-          <w:rFonts w:ascii="Garamond" w:hAnsi="Garamond"/>
-        </w:rPr>
-        <w:br w:type="page"/>
-      </w:r>
     </w:p>
     <w:p>
       <w:pPr>
@@ -1440,7 +1383,6 @@
         <w:rPr>
           <w:rFonts w:ascii="Garamond" w:hAnsi="Garamond"/>
         </w:rPr>
-        <w:lastRenderedPageBreak/>
         <w:t>5. Environnement de simulation</w:t>
       </w:r>
     </w:p>
@@ -1768,12 +1710,6 @@
           <w:rFonts w:ascii="Garamond" w:hAnsi="Garamond"/>
         </w:rPr>
       </w:pPr>
-      <w:r>
-        <w:rPr>
-          <w:rFonts w:ascii="Garamond" w:hAnsi="Garamond"/>
-        </w:rPr>
-        <w:br w:type="page"/>
-      </w:r>
     </w:p>
     <w:p>
       <w:pPr>
@@ -1788,7 +1724,6 @@
         <w:rPr>
           <w:rFonts w:ascii="Garamond" w:hAnsi="Garamond"/>
         </w:rPr>
-        <w:lastRenderedPageBreak/>
         <w:t>7. Implémentation DQN</w:t>
       </w:r>
     </w:p>
@@ -1900,6 +1835,7 @@
           <w:rFonts w:ascii="Garamond" w:hAnsi="Garamond"/>
           <w:noProof/>
         </w:rPr>
+        <w:lastRenderedPageBreak/>
         <w:drawing>
           <wp:inline distT="0" distB="0" distL="0" distR="0" wp14:anchorId="6B5C0F48" wp14:editId="45C33D35">
             <wp:extent cx="5486400" cy="1828800"/>
@@ -1974,12 +1910,6 @@
           <w:rFonts w:ascii="Garamond" w:hAnsi="Garamond"/>
         </w:rPr>
       </w:pPr>
-      <w:r>
-        <w:rPr>
-          <w:rFonts w:ascii="Garamond" w:hAnsi="Garamond"/>
-        </w:rPr>
-        <w:br w:type="page"/>
-      </w:r>
     </w:p>
     <w:p>
       <w:pPr>
@@ -1994,7 +1924,6 @@
         <w:rPr>
           <w:rFonts w:ascii="Garamond" w:hAnsi="Garamond"/>
         </w:rPr>
-        <w:lastRenderedPageBreak/>
         <w:t>8. Résultats de performance</w:t>
       </w:r>
     </w:p>
@@ -2038,12 +1967,6 @@
         <w:gridCol w:w="2254"/>
       </w:tblGrid>
       <w:tr>
-        <w:tblPrEx>
-          <w:tblCellMar>
-            <w:top w:w="0" w:type="dxa"/>
-            <w:bottom w:w="0" w:type="dxa"/>
-          </w:tblCellMar>
-        </w:tblPrEx>
         <w:tc>
           <w:tcPr>
             <w:tcW w:w="2256" w:type="dxa"/>
@@ -2138,12 +2061,6 @@
         </w:tc>
       </w:tr>
       <w:tr>
-        <w:tblPrEx>
-          <w:tblCellMar>
-            <w:top w:w="0" w:type="dxa"/>
-            <w:bottom w:w="0" w:type="dxa"/>
-          </w:tblCellMar>
-        </w:tblPrEx>
         <w:tc>
           <w:tcPr>
             <w:tcW w:w="2256" w:type="dxa"/>
@@ -2227,12 +2144,6 @@
         </w:tc>
       </w:tr>
       <w:tr>
-        <w:tblPrEx>
-          <w:tblCellMar>
-            <w:top w:w="0" w:type="dxa"/>
-            <w:bottom w:w="0" w:type="dxa"/>
-          </w:tblCellMar>
-        </w:tblPrEx>
         <w:tc>
           <w:tcPr>
             <w:tcW w:w="2256" w:type="dxa"/>
@@ -2320,12 +2231,6 @@
         </w:tc>
       </w:tr>
       <w:tr>
-        <w:tblPrEx>
-          <w:tblCellMar>
-            <w:top w:w="0" w:type="dxa"/>
-            <w:bottom w:w="0" w:type="dxa"/>
-          </w:tblCellMar>
-        </w:tblPrEx>
         <w:tc>
           <w:tcPr>
             <w:tcW w:w="2256" w:type="dxa"/>
@@ -2887,14 +2792,9 @@
         <w:jc w:val="both"/>
         <w:rPr>
           <w:rFonts w:ascii="Garamond" w:hAnsi="Garamond"/>
-        </w:rPr>
-      </w:pPr>
-      <w:r>
-        <w:rPr>
-          <w:rFonts w:ascii="Garamond" w:hAnsi="Garamond"/>
-        </w:rPr>
-        <w:br w:type="page"/>
-      </w:r>
+          <w:lang w:val="fr-FR"/>
+        </w:rPr>
+      </w:pPr>
     </w:p>
     <w:p>
       <w:pPr>
@@ -2909,7 +2809,6 @@
         <w:rPr>
           <w:rFonts w:ascii="Garamond" w:hAnsi="Garamond"/>
         </w:rPr>
-        <w:lastRenderedPageBreak/>
         <w:t>11. Limitations et travail futur</w:t>
       </w:r>
     </w:p>
@@ -3071,14 +2970,9 @@
         <w:jc w:val="both"/>
         <w:rPr>
           <w:rFonts w:ascii="Garamond" w:hAnsi="Garamond"/>
-        </w:rPr>
-      </w:pPr>
-      <w:r>
-        <w:rPr>
-          <w:rFonts w:ascii="Garamond" w:hAnsi="Garamond"/>
-        </w:rPr>
-        <w:br w:type="page"/>
-      </w:r>
+          <w:lang w:val="fr-FR"/>
+        </w:rPr>
+      </w:pPr>
     </w:p>
     <w:p>
       <w:pPr>
@@ -3093,7 +2987,6 @@
         <w:rPr>
           <w:rFonts w:ascii="Garamond" w:hAnsi="Garamond"/>
         </w:rPr>
-        <w:lastRenderedPageBreak/>
         <w:t>12. Conclusion</w:t>
       </w:r>
     </w:p>
@@ -3236,6 +3129,7 @@
         <w:jc w:val="both"/>
         <w:rPr>
           <w:rFonts w:ascii="Garamond" w:hAnsi="Garamond"/>
+          <w:lang w:val="fr-FR"/>
         </w:rPr>
       </w:pPr>
       <w:r>
@@ -3291,21 +3185,6 @@
           <w:rFonts w:ascii="Garamond" w:hAnsi="Garamond"/>
         </w:rPr>
         <w:t>Implémentation réelle : +10-20% revenus chauffeurs via repositionnement optimal</w:t>
-      </w:r>
-    </w:p>
-    <w:p>
-      <w:pPr>
-        <w:pStyle w:val="Normal1"/>
-        <w:jc w:val="both"/>
-        <w:rPr>
-          <w:rFonts w:ascii="Garamond" w:hAnsi="Garamond"/>
-        </w:rPr>
-      </w:pPr>
-      <w:r>
-        <w:rPr>
-          <w:rFonts w:ascii="Garamond" w:hAnsi="Garamond"/>
-        </w:rPr>
-        <w:br w:type="page"/>
       </w:r>
     </w:p>
     <w:p>
@@ -4238,6 +4117,7 @@
   <w:style w:type="character" w:default="1" w:styleId="DefaultParagraphFont">
     <w:name w:val="Default Paragraph Font"/>
     <w:uiPriority w:val="1"/>
+    <w:semiHidden/>
     <w:unhideWhenUsed/>
   </w:style>
   <w:style w:type="table" w:default="1" w:styleId="TableNormal">

</xml_diff>